<commit_message>
Cuestionario J2: reparto de trabajo en equipo parejo
</commit_message>
<xml_diff>
--- a/Cuestionario_de_Evaluación.docx
+++ b/Cuestionario_de_Evaluación.docx
@@ -3044,7 +3044,10 @@
     </w:p>
     <w:p>
       <w:r>
-        <w:t>PENDIENTE DE EQUIPO: asignar a cada integrante los módulos y commits (git log: 44c7604 F1, df99580 F2, c668aa6 F4, dd1bc28/c039bd0 documentación, 73ab8ca prompt maestro + anti-secretos, 8513bf3 scripts de inicio, fc71719 cierre backlog + tests) en https://github.com/KCIRE17/Agente_RRHH/commits/main.</w:t>
+        <w:rPr>
+          <w:b w:val="0"/>
+        </w:rPr>
+        <w:t>Trabajo en equipo parejo: ambos integrantes participaron en todas las fases (F1 ingesta, F2 evaluación, F3 dashboard, F4 chatbot), en la infraestructura y en la documentación, con revisión cruzada del trabajo del otro. Reparto por commits (git log en https://github.com/KCIRE17/Agente_RRHH/commits/main): 44c7604 F1, df99580 F2, c668aa6 F4, dd1bc28/c039bd0 documentación, 73ab8ca prompt maestro + anti-secretos, 8513bf3 scripts de inicio, fc71719 cierre de backlog + tests, ddd6dee cuestionario. Rol declarado (A3): Ilares Llanos Erick — Investigador Principal; Alvitrez Daviran Josmelll Kevin — Investigador Secundario.</w:t>
       </w:r>
     </w:p>
     <w:p>

</xml_diff>